<commit_message>
Propagate questionnaires (S9) and Bayesian analysis (S10) to journal supplementary
Extends the supplementary material to mirror the full article: S9 adds the other
monitoring questionnaires (TQR/Epworth/PSS) and S10 the Bayesian/equivalence
analysis (Bayes factors for the D1→D7 change). Supplementary now S1–S10
(10 tables, 13 figures). Reproducible: scripts/analise/build_suplementar.py.
Athletes anonymized; no raw data or names committed.

Co-Authored-By: Claude Opus 4.8 <noreply@anthropic.com>
Claude-Session: https://claude.ai/code/session_01P7yGiDeoGDyjWvPWQVsUrj
</commit_message>
<xml_diff>
--- a/Artigos/Material_Suplementar_Periodico.docx
+++ b/Artigos/Material_Suplementar_Periodico.docx
@@ -5420,6 +5420,1197 @@
     </w:p>
     <w:p>
       <w:pPr>
+        <w:spacing w:before="200" w:after="60"/>
+      </w:pPr>
+      <w:r>
+        <w:rPr>
+          <w:rFonts w:ascii="Times New Roman" w:hAnsi="Times New Roman"/>
+          <w:b/>
+          <w:i w:val="0"/>
+          <w:sz w:val="24"/>
+        </w:rPr>
+        <w:t>S9. Outros indicadores de monitoramento coletados na semana (TQR, Epworth, PSS)</w:t>
+      </w:r>
+    </w:p>
+    <w:p>
+      <w:pPr>
+        <w:spacing w:before="80" w:line="240" w:lineRule="auto"/>
+        <w:jc w:val="left"/>
+      </w:pPr>
+      <w:r>
+        <w:rPr>
+          <w:rFonts w:ascii="Times New Roman" w:hAnsi="Times New Roman"/>
+          <w:b w:val="0"/>
+          <w:i w:val="0"/>
+          <w:sz w:val="19"/>
+        </w:rPr>
+        <w:t>Tabela S9 – Comportamento na semana da recuperação percebida (TQR), sonolência (Epworth) e estresse percebido (PSS)</w:t>
+      </w:r>
+    </w:p>
+    <w:tbl>
+      <w:tblPr>
+        <w:tblW w:type="auto" w:w="0"/>
+        <w:jc w:val="center"/>
+        <w:tblLook w:firstColumn="1" w:firstRow="1" w:lastColumn="0" w:lastRow="0" w:noHBand="0" w:noVBand="1" w:val="04A0"/>
+        <w:tblBorders>
+          <w:top w:val="single" w:sz="6" w:space="0" w:color="000000"/>
+          <w:bottom w:val="single" w:sz="6" w:space="0" w:color="000000"/>
+          <w:insideH w:val="single" w:sz="6" w:space="0" w:color="000000"/>
+          <w:left w:val="none"/>
+          <w:right w:val="none"/>
+          <w:insideV w:val="none"/>
+        </w:tblBorders>
+      </w:tblPr>
+      <w:tblGrid>
+        <w:gridCol w:w="1567"/>
+        <w:gridCol w:w="1567"/>
+        <w:gridCol w:w="1567"/>
+        <w:gridCol w:w="1567"/>
+        <w:gridCol w:w="1567"/>
+        <w:gridCol w:w="1567"/>
+      </w:tblGrid>
+      <w:tr>
+        <w:tc>
+          <w:tcPr>
+            <w:tcW w:type="dxa" w:w="1567"/>
+          </w:tcPr>
+          <w:p>
+            <w:r>
+              <w:rPr>
+                <w:rFonts w:ascii="Times New Roman" w:hAnsi="Times New Roman"/>
+                <w:b/>
+                <w:i w:val="0"/>
+                <w:sz w:val="17"/>
+              </w:rPr>
+              <w:t>Indicador</w:t>
+            </w:r>
+          </w:p>
+        </w:tc>
+        <w:tc>
+          <w:tcPr>
+            <w:tcW w:type="dxa" w:w="1567"/>
+          </w:tcPr>
+          <w:p>
+            <w:r>
+              <w:rPr>
+                <w:rFonts w:ascii="Times New Roman" w:hAnsi="Times New Roman"/>
+                <w:b/>
+                <w:i w:val="0"/>
+                <w:sz w:val="17"/>
+              </w:rPr>
+              <w:t>Dia 1</w:t>
+            </w:r>
+          </w:p>
+        </w:tc>
+        <w:tc>
+          <w:tcPr>
+            <w:tcW w:type="dxa" w:w="1567"/>
+          </w:tcPr>
+          <w:p>
+            <w:r>
+              <w:rPr>
+                <w:rFonts w:ascii="Times New Roman" w:hAnsi="Times New Roman"/>
+                <w:b/>
+                <w:i w:val="0"/>
+                <w:sz w:val="17"/>
+              </w:rPr>
+              <w:t>Dia 7</w:t>
+            </w:r>
+          </w:p>
+        </w:tc>
+        <w:tc>
+          <w:tcPr>
+            <w:tcW w:type="dxa" w:w="1567"/>
+          </w:tcPr>
+          <w:p>
+            <w:r>
+              <w:rPr>
+                <w:rFonts w:ascii="Times New Roman" w:hAnsi="Times New Roman"/>
+                <w:b/>
+                <w:i w:val="0"/>
+                <w:sz w:val="17"/>
+              </w:rPr>
+              <w:t>Coef./dia</w:t>
+            </w:r>
+          </w:p>
+        </w:tc>
+        <w:tc>
+          <w:tcPr>
+            <w:tcW w:type="dxa" w:w="1567"/>
+          </w:tcPr>
+          <w:p>
+            <w:r>
+              <w:rPr>
+                <w:rFonts w:ascii="Times New Roman" w:hAnsi="Times New Roman"/>
+                <w:b/>
+                <w:i w:val="0"/>
+                <w:sz w:val="17"/>
+              </w:rPr>
+              <w:t>p</w:t>
+            </w:r>
+          </w:p>
+        </w:tc>
+        <w:tc>
+          <w:tcPr>
+            <w:tcW w:type="dxa" w:w="1567"/>
+          </w:tcPr>
+          <w:p>
+            <w:r>
+              <w:rPr>
+                <w:rFonts w:ascii="Times New Roman" w:hAnsi="Times New Roman"/>
+                <w:b/>
+                <w:i w:val="0"/>
+                <w:sz w:val="17"/>
+              </w:rPr>
+              <w:t>ρ × fadiga física</w:t>
+            </w:r>
+          </w:p>
+        </w:tc>
+      </w:tr>
+      <w:tr>
+        <w:tc>
+          <w:tcPr>
+            <w:tcW w:type="dxa" w:w="1567"/>
+          </w:tcPr>
+          <w:p>
+            <w:r>
+              <w:rPr>
+                <w:rFonts w:ascii="Times New Roman" w:hAnsi="Times New Roman"/>
+                <w:b w:val="0"/>
+                <w:i w:val="0"/>
+                <w:sz w:val="17"/>
+              </w:rPr>
+              <w:t>Recuperação (TQR)</w:t>
+            </w:r>
+          </w:p>
+        </w:tc>
+        <w:tc>
+          <w:tcPr>
+            <w:tcW w:type="dxa" w:w="1567"/>
+          </w:tcPr>
+          <w:p>
+            <w:r>
+              <w:rPr>
+                <w:rFonts w:ascii="Times New Roman" w:hAnsi="Times New Roman"/>
+                <w:b w:val="0"/>
+                <w:i w:val="0"/>
+                <w:sz w:val="17"/>
+              </w:rPr>
+              <w:t>13,4</w:t>
+            </w:r>
+          </w:p>
+        </w:tc>
+        <w:tc>
+          <w:tcPr>
+            <w:tcW w:type="dxa" w:w="1567"/>
+          </w:tcPr>
+          <w:p>
+            <w:r>
+              <w:rPr>
+                <w:rFonts w:ascii="Times New Roman" w:hAnsi="Times New Roman"/>
+                <w:b w:val="0"/>
+                <w:i w:val="0"/>
+                <w:sz w:val="17"/>
+              </w:rPr>
+              <w:t>9,6</w:t>
+            </w:r>
+          </w:p>
+        </w:tc>
+        <w:tc>
+          <w:tcPr>
+            <w:tcW w:type="dxa" w:w="1567"/>
+          </w:tcPr>
+          <w:p>
+            <w:r>
+              <w:rPr>
+                <w:rFonts w:ascii="Times New Roman" w:hAnsi="Times New Roman"/>
+                <w:b w:val="0"/>
+                <w:i w:val="0"/>
+                <w:sz w:val="17"/>
+              </w:rPr>
+              <w:t>-0,23</w:t>
+            </w:r>
+          </w:p>
+        </w:tc>
+        <w:tc>
+          <w:tcPr>
+            <w:tcW w:type="dxa" w:w="1567"/>
+          </w:tcPr>
+          <w:p>
+            <w:r>
+              <w:rPr>
+                <w:rFonts w:ascii="Times New Roman" w:hAnsi="Times New Roman"/>
+                <w:b w:val="0"/>
+                <w:i w:val="0"/>
+                <w:sz w:val="17"/>
+              </w:rPr>
+              <w:t>0,017</w:t>
+            </w:r>
+          </w:p>
+        </w:tc>
+        <w:tc>
+          <w:tcPr>
+            <w:tcW w:type="dxa" w:w="1567"/>
+          </w:tcPr>
+          <w:p>
+            <w:r>
+              <w:rPr>
+                <w:rFonts w:ascii="Times New Roman" w:hAnsi="Times New Roman"/>
+                <w:b w:val="0"/>
+                <w:i w:val="0"/>
+                <w:sz w:val="17"/>
+              </w:rPr>
+              <w:t>-0,69</w:t>
+            </w:r>
+          </w:p>
+        </w:tc>
+      </w:tr>
+      <w:tr>
+        <w:tc>
+          <w:tcPr>
+            <w:tcW w:type="dxa" w:w="1567"/>
+          </w:tcPr>
+          <w:p>
+            <w:r>
+              <w:rPr>
+                <w:rFonts w:ascii="Times New Roman" w:hAnsi="Times New Roman"/>
+                <w:b w:val="0"/>
+                <w:i w:val="0"/>
+                <w:sz w:val="17"/>
+              </w:rPr>
+              <w:t>Sonolência (Epworth)</w:t>
+            </w:r>
+          </w:p>
+        </w:tc>
+        <w:tc>
+          <w:tcPr>
+            <w:tcW w:type="dxa" w:w="1567"/>
+          </w:tcPr>
+          <w:p>
+            <w:r>
+              <w:rPr>
+                <w:rFonts w:ascii="Times New Roman" w:hAnsi="Times New Roman"/>
+                <w:b w:val="0"/>
+                <w:i w:val="0"/>
+                <w:sz w:val="17"/>
+              </w:rPr>
+              <w:t>9,1</w:t>
+            </w:r>
+          </w:p>
+        </w:tc>
+        <w:tc>
+          <w:tcPr>
+            <w:tcW w:type="dxa" w:w="1567"/>
+          </w:tcPr>
+          <w:p>
+            <w:r>
+              <w:rPr>
+                <w:rFonts w:ascii="Times New Roman" w:hAnsi="Times New Roman"/>
+                <w:b w:val="0"/>
+                <w:i w:val="0"/>
+                <w:sz w:val="17"/>
+              </w:rPr>
+              <w:t>11,5</w:t>
+            </w:r>
+          </w:p>
+        </w:tc>
+        <w:tc>
+          <w:tcPr>
+            <w:tcW w:type="dxa" w:w="1567"/>
+          </w:tcPr>
+          <w:p>
+            <w:r>
+              <w:rPr>
+                <w:rFonts w:ascii="Times New Roman" w:hAnsi="Times New Roman"/>
+                <w:b w:val="0"/>
+                <w:i w:val="0"/>
+                <w:sz w:val="17"/>
+              </w:rPr>
+              <w:t>+0,33</w:t>
+            </w:r>
+          </w:p>
+        </w:tc>
+        <w:tc>
+          <w:tcPr>
+            <w:tcW w:type="dxa" w:w="1567"/>
+          </w:tcPr>
+          <w:p>
+            <w:r>
+              <w:rPr>
+                <w:rFonts w:ascii="Times New Roman" w:hAnsi="Times New Roman"/>
+                <w:b w:val="0"/>
+                <w:i w:val="0"/>
+                <w:sz w:val="17"/>
+              </w:rPr>
+              <w:t>0,036</w:t>
+            </w:r>
+          </w:p>
+        </w:tc>
+        <w:tc>
+          <w:tcPr>
+            <w:tcW w:type="dxa" w:w="1567"/>
+          </w:tcPr>
+          <w:p>
+            <w:r>
+              <w:rPr>
+                <w:rFonts w:ascii="Times New Roman" w:hAnsi="Times New Roman"/>
+                <w:b w:val="0"/>
+                <w:i w:val="0"/>
+                <w:sz w:val="17"/>
+              </w:rPr>
+              <w:t>+0,22</w:t>
+            </w:r>
+          </w:p>
+        </w:tc>
+      </w:tr>
+      <w:tr>
+        <w:tc>
+          <w:tcPr>
+            <w:tcW w:type="dxa" w:w="1567"/>
+          </w:tcPr>
+          <w:p>
+            <w:r>
+              <w:rPr>
+                <w:rFonts w:ascii="Times New Roman" w:hAnsi="Times New Roman"/>
+                <w:b w:val="0"/>
+                <w:i w:val="0"/>
+                <w:sz w:val="17"/>
+              </w:rPr>
+              <w:t>Estresse (PSS)</w:t>
+            </w:r>
+          </w:p>
+        </w:tc>
+        <w:tc>
+          <w:tcPr>
+            <w:tcW w:type="dxa" w:w="1567"/>
+          </w:tcPr>
+          <w:p>
+            <w:r>
+              <w:rPr>
+                <w:rFonts w:ascii="Times New Roman" w:hAnsi="Times New Roman"/>
+                <w:b w:val="0"/>
+                <w:i w:val="0"/>
+                <w:sz w:val="17"/>
+              </w:rPr>
+              <w:t>22,6</w:t>
+            </w:r>
+          </w:p>
+        </w:tc>
+        <w:tc>
+          <w:tcPr>
+            <w:tcW w:type="dxa" w:w="1567"/>
+          </w:tcPr>
+          <w:p>
+            <w:r>
+              <w:rPr>
+                <w:rFonts w:ascii="Times New Roman" w:hAnsi="Times New Roman"/>
+                <w:b w:val="0"/>
+                <w:i w:val="0"/>
+                <w:sz w:val="17"/>
+              </w:rPr>
+              <w:t>21,7</w:t>
+            </w:r>
+          </w:p>
+        </w:tc>
+        <w:tc>
+          <w:tcPr>
+            <w:tcW w:type="dxa" w:w="1567"/>
+          </w:tcPr>
+          <w:p>
+            <w:r>
+              <w:rPr>
+                <w:rFonts w:ascii="Times New Roman" w:hAnsi="Times New Roman"/>
+                <w:b w:val="0"/>
+                <w:i w:val="0"/>
+                <w:sz w:val="17"/>
+              </w:rPr>
+              <w:t>-0,17</w:t>
+            </w:r>
+          </w:p>
+        </w:tc>
+        <w:tc>
+          <w:tcPr>
+            <w:tcW w:type="dxa" w:w="1567"/>
+          </w:tcPr>
+          <w:p>
+            <w:r>
+              <w:rPr>
+                <w:rFonts w:ascii="Times New Roman" w:hAnsi="Times New Roman"/>
+                <w:b w:val="0"/>
+                <w:i w:val="0"/>
+                <w:sz w:val="17"/>
+              </w:rPr>
+              <w:t>0,369</w:t>
+            </w:r>
+          </w:p>
+        </w:tc>
+        <w:tc>
+          <w:tcPr>
+            <w:tcW w:type="dxa" w:w="1567"/>
+          </w:tcPr>
+          <w:p>
+            <w:r>
+              <w:rPr>
+                <w:rFonts w:ascii="Times New Roman" w:hAnsi="Times New Roman"/>
+                <w:b w:val="0"/>
+                <w:i w:val="0"/>
+                <w:sz w:val="17"/>
+              </w:rPr>
+              <w:t>+0,05</w:t>
+            </w:r>
+          </w:p>
+        </w:tc>
+      </w:tr>
+    </w:tbl>
+    <w:p>
+      <w:pPr>
+        <w:spacing w:after="120" w:line="240" w:lineRule="auto"/>
+      </w:pPr>
+      <w:r>
+        <w:rPr>
+          <w:rFonts w:ascii="Times New Roman" w:hAnsi="Times New Roman"/>
+          <w:b w:val="0"/>
+          <w:i w:val="0"/>
+          <w:sz w:val="18"/>
+        </w:rPr>
+        <w:t>Fonte: dados da pesquisa (2026).</w:t>
+      </w:r>
+    </w:p>
+    <w:p>
+      <w:pPr>
+        <w:spacing w:line="336" w:lineRule="auto"/>
+        <w:ind w:firstLine="709"/>
+        <w:jc w:val="both"/>
+      </w:pPr>
+      <w:r>
+        <w:rPr>
+          <w:rFonts w:ascii="Times New Roman" w:hAnsi="Times New Roman"/>
+          <w:b w:val="0"/>
+          <w:i w:val="0"/>
+          <w:sz w:val="22"/>
+        </w:rPr>
+        <w:t>A recuperação percebida (TQR) deteriorou-se (b = −0,23/dia; p = 0,017) e correlacionou-se inversamente com a fadiga física (ρ = −0,69), integrando o eixo energia–fadiga; a sonolência (Epworth) aumentou (acúmulo crônico); o estresse (PSS) permaneceu estável e independente da fadiga (traço). Dados da TQR extraídos em nível de grupo da base de wellness (sem identificação).</w:t>
+      </w:r>
+    </w:p>
+    <w:p>
+      <w:pPr>
+        <w:spacing w:before="80" w:line="240" w:lineRule="auto"/>
+        <w:jc w:val="center"/>
+      </w:pPr>
+      <w:r>
+        <w:rPr>
+          <w:rFonts w:ascii="Times New Roman" w:hAnsi="Times New Roman"/>
+          <w:b w:val="0"/>
+          <w:i w:val="0"/>
+          <w:sz w:val="19"/>
+        </w:rPr>
+        <w:t>Figura S12 – Comportamento semanal da TQR, Epworth e PSS (reta tracejada = tendência)</w:t>
+      </w:r>
+    </w:p>
+    <w:p>
+      <w:pPr>
+        <w:jc w:val="center"/>
+      </w:pPr>
+      <w:r>
+        <w:drawing>
+          <wp:inline xmlns:a="http://schemas.openxmlformats.org/drawingml/2006/main" xmlns:pic="http://schemas.openxmlformats.org/drawingml/2006/picture">
+            <wp:extent cx="5303520" cy="1856232"/>
+            <wp:docPr id="12" name="Picture 12"/>
+            <wp:cNvGraphicFramePr>
+              <a:graphicFrameLocks noChangeAspect="1"/>
+            </wp:cNvGraphicFramePr>
+            <a:graphic>
+              <a:graphicData uri="http://schemas.openxmlformats.org/drawingml/2006/picture">
+                <pic:pic>
+                  <pic:nvPicPr>
+                    <pic:cNvPr id="0" name="x_wellness.png"/>
+                    <pic:cNvPicPr/>
+                  </pic:nvPicPr>
+                  <pic:blipFill>
+                    <a:blip r:embed="rId20"/>
+                    <a:stretch>
+                      <a:fillRect/>
+                    </a:stretch>
+                  </pic:blipFill>
+                  <pic:spPr>
+                    <a:xfrm>
+                      <a:off x="0" y="0"/>
+                      <a:ext cx="5303520" cy="1856232"/>
+                    </a:xfrm>
+                    <a:prstGeom prst="rect"/>
+                  </pic:spPr>
+                </pic:pic>
+              </a:graphicData>
+            </a:graphic>
+          </wp:inline>
+        </w:drawing>
+      </w:r>
+    </w:p>
+    <w:p>
+      <w:pPr>
+        <w:spacing w:after="120" w:line="240" w:lineRule="auto"/>
+        <w:jc w:val="center"/>
+      </w:pPr>
+      <w:r>
+        <w:rPr>
+          <w:rFonts w:ascii="Times New Roman" w:hAnsi="Times New Roman"/>
+          <w:b w:val="0"/>
+          <w:i w:val="0"/>
+          <w:sz w:val="18"/>
+        </w:rPr>
+        <w:t>Fonte: elaborado pelos autores (2026).</w:t>
+      </w:r>
+    </w:p>
+    <w:p>
+      <w:pPr>
+        <w:spacing w:before="200" w:after="60"/>
+      </w:pPr>
+      <w:r>
+        <w:rPr>
+          <w:rFonts w:ascii="Times New Roman" w:hAnsi="Times New Roman"/>
+          <w:b/>
+          <w:i w:val="0"/>
+          <w:sz w:val="24"/>
+        </w:rPr>
+        <w:t>S10. Análise bayesiana e de equivalência (mudança D1→D7)</w:t>
+      </w:r>
+    </w:p>
+    <w:p>
+      <w:pPr>
+        <w:spacing w:before="80" w:line="240" w:lineRule="auto"/>
+        <w:jc w:val="left"/>
+      </w:pPr>
+      <w:r>
+        <w:rPr>
+          <w:rFonts w:ascii="Times New Roman" w:hAnsi="Times New Roman"/>
+          <w:b w:val="0"/>
+          <w:i w:val="0"/>
+          <w:sz w:val="19"/>
+        </w:rPr>
+        <w:t>Tabela S10 – Fatores de Bayes (BF₁₀) para a mudança D1→D7 e classificação da evidência (BF &gt; 3 = efeito; BF &lt; 1/3 = ausência)</w:t>
+      </w:r>
+    </w:p>
+    <w:tbl>
+      <w:tblPr>
+        <w:tblW w:type="auto" w:w="0"/>
+        <w:jc w:val="center"/>
+        <w:tblLook w:firstColumn="1" w:firstRow="1" w:lastColumn="0" w:lastRow="0" w:noHBand="0" w:noVBand="1" w:val="04A0"/>
+        <w:tblBorders>
+          <w:top w:val="single" w:sz="6" w:space="0" w:color="000000"/>
+          <w:bottom w:val="single" w:sz="6" w:space="0" w:color="000000"/>
+          <w:insideH w:val="single" w:sz="6" w:space="0" w:color="000000"/>
+          <w:left w:val="none"/>
+          <w:right w:val="none"/>
+          <w:insideV w:val="none"/>
+        </w:tblBorders>
+      </w:tblPr>
+      <w:tblGrid>
+        <w:gridCol w:w="3135"/>
+        <w:gridCol w:w="3135"/>
+        <w:gridCol w:w="3135"/>
+      </w:tblGrid>
+      <w:tr>
+        <w:tc>
+          <w:tcPr>
+            <w:tcW w:type="dxa" w:w="3135"/>
+          </w:tcPr>
+          <w:p>
+            <w:r>
+              <w:rPr>
+                <w:rFonts w:ascii="Times New Roman" w:hAnsi="Times New Roman"/>
+                <w:b/>
+                <w:i w:val="0"/>
+                <w:sz w:val="17"/>
+              </w:rPr>
+              <w:t>Variável</w:t>
+            </w:r>
+          </w:p>
+        </w:tc>
+        <w:tc>
+          <w:tcPr>
+            <w:tcW w:type="dxa" w:w="3135"/>
+          </w:tcPr>
+          <w:p>
+            <w:r>
+              <w:rPr>
+                <w:rFonts w:ascii="Times New Roman" w:hAnsi="Times New Roman"/>
+                <w:b/>
+                <w:i w:val="0"/>
+                <w:sz w:val="17"/>
+              </w:rPr>
+              <w:t>BF₁₀</w:t>
+            </w:r>
+          </w:p>
+        </w:tc>
+        <w:tc>
+          <w:tcPr>
+            <w:tcW w:type="dxa" w:w="3135"/>
+          </w:tcPr>
+          <w:p>
+            <w:r>
+              <w:rPr>
+                <w:rFonts w:ascii="Times New Roman" w:hAnsi="Times New Roman"/>
+                <w:b/>
+                <w:i w:val="0"/>
+                <w:sz w:val="17"/>
+              </w:rPr>
+              <w:t>Evidência</w:t>
+            </w:r>
+          </w:p>
+        </w:tc>
+      </w:tr>
+      <w:tr>
+        <w:tc>
+          <w:tcPr>
+            <w:tcW w:type="dxa" w:w="3135"/>
+          </w:tcPr>
+          <w:p>
+            <w:r>
+              <w:rPr>
+                <w:rFonts w:ascii="Times New Roman" w:hAnsi="Times New Roman"/>
+                <w:b w:val="0"/>
+                <w:i w:val="0"/>
+                <w:sz w:val="17"/>
+              </w:rPr>
+              <w:t>Fadiga física</w:t>
+            </w:r>
+          </w:p>
+        </w:tc>
+        <w:tc>
+          <w:tcPr>
+            <w:tcW w:type="dxa" w:w="3135"/>
+          </w:tcPr>
+          <w:p>
+            <w:r>
+              <w:rPr>
+                <w:rFonts w:ascii="Times New Roman" w:hAnsi="Times New Roman"/>
+                <w:b w:val="0"/>
+                <w:i w:val="0"/>
+                <w:sz w:val="17"/>
+              </w:rPr>
+              <w:t>462818</w:t>
+            </w:r>
+          </w:p>
+        </w:tc>
+        <w:tc>
+          <w:tcPr>
+            <w:tcW w:type="dxa" w:w="3135"/>
+          </w:tcPr>
+          <w:p>
+            <w:r>
+              <w:rPr>
+                <w:rFonts w:ascii="Times New Roman" w:hAnsi="Times New Roman"/>
+                <w:b w:val="0"/>
+                <w:i w:val="0"/>
+                <w:sz w:val="17"/>
+              </w:rPr>
+              <w:t>evidência de efeito</w:t>
+            </w:r>
+          </w:p>
+        </w:tc>
+      </w:tr>
+      <w:tr>
+        <w:tc>
+          <w:tcPr>
+            <w:tcW w:type="dxa" w:w="3135"/>
+          </w:tcPr>
+          <w:p>
+            <w:r>
+              <w:rPr>
+                <w:rFonts w:ascii="Times New Roman" w:hAnsi="Times New Roman"/>
+                <w:b w:val="0"/>
+                <w:i w:val="0"/>
+                <w:sz w:val="17"/>
+              </w:rPr>
+              <w:t>Vigor</w:t>
+            </w:r>
+          </w:p>
+        </w:tc>
+        <w:tc>
+          <w:tcPr>
+            <w:tcW w:type="dxa" w:w="3135"/>
+          </w:tcPr>
+          <w:p>
+            <w:r>
+              <w:rPr>
+                <w:rFonts w:ascii="Times New Roman" w:hAnsi="Times New Roman"/>
+                <w:b w:val="0"/>
+                <w:i w:val="0"/>
+                <w:sz w:val="17"/>
+              </w:rPr>
+              <w:t>1081</w:t>
+            </w:r>
+          </w:p>
+        </w:tc>
+        <w:tc>
+          <w:tcPr>
+            <w:tcW w:type="dxa" w:w="3135"/>
+          </w:tcPr>
+          <w:p>
+            <w:r>
+              <w:rPr>
+                <w:rFonts w:ascii="Times New Roman" w:hAnsi="Times New Roman"/>
+                <w:b w:val="0"/>
+                <w:i w:val="0"/>
+                <w:sz w:val="17"/>
+              </w:rPr>
+              <w:t>evidência de efeito</w:t>
+            </w:r>
+          </w:p>
+        </w:tc>
+      </w:tr>
+      <w:tr>
+        <w:tc>
+          <w:tcPr>
+            <w:tcW w:type="dxa" w:w="3135"/>
+          </w:tcPr>
+          <w:p>
+            <w:r>
+              <w:rPr>
+                <w:rFonts w:ascii="Times New Roman" w:hAnsi="Times New Roman"/>
+                <w:b w:val="0"/>
+                <w:i w:val="0"/>
+                <w:sz w:val="17"/>
+              </w:rPr>
+              <w:t>Fadiga (BRUMS)</w:t>
+            </w:r>
+          </w:p>
+        </w:tc>
+        <w:tc>
+          <w:tcPr>
+            <w:tcW w:type="dxa" w:w="3135"/>
+          </w:tcPr>
+          <w:p>
+            <w:r>
+              <w:rPr>
+                <w:rFonts w:ascii="Times New Roman" w:hAnsi="Times New Roman"/>
+                <w:b w:val="0"/>
+                <w:i w:val="0"/>
+                <w:sz w:val="17"/>
+              </w:rPr>
+              <w:t>14,16</w:t>
+            </w:r>
+          </w:p>
+        </w:tc>
+        <w:tc>
+          <w:tcPr>
+            <w:tcW w:type="dxa" w:w="3135"/>
+          </w:tcPr>
+          <w:p>
+            <w:r>
+              <w:rPr>
+                <w:rFonts w:ascii="Times New Roman" w:hAnsi="Times New Roman"/>
+                <w:b w:val="0"/>
+                <w:i w:val="0"/>
+                <w:sz w:val="17"/>
+              </w:rPr>
+              <w:t>evidência de efeito</w:t>
+            </w:r>
+          </w:p>
+        </w:tc>
+      </w:tr>
+      <w:tr>
+        <w:tc>
+          <w:tcPr>
+            <w:tcW w:type="dxa" w:w="3135"/>
+          </w:tcPr>
+          <w:p>
+            <w:r>
+              <w:rPr>
+                <w:rFonts w:ascii="Times New Roman" w:hAnsi="Times New Roman"/>
+                <w:b w:val="0"/>
+                <w:i w:val="0"/>
+                <w:sz w:val="17"/>
+              </w:rPr>
+              <w:t>PTH/TMD</w:t>
+            </w:r>
+          </w:p>
+        </w:tc>
+        <w:tc>
+          <w:tcPr>
+            <w:tcW w:type="dxa" w:w="3135"/>
+          </w:tcPr>
+          <w:p>
+            <w:r>
+              <w:rPr>
+                <w:rFonts w:ascii="Times New Roman" w:hAnsi="Times New Roman"/>
+                <w:b w:val="0"/>
+                <w:i w:val="0"/>
+                <w:sz w:val="17"/>
+              </w:rPr>
+              <w:t>1,37</w:t>
+            </w:r>
+          </w:p>
+        </w:tc>
+        <w:tc>
+          <w:tcPr>
+            <w:tcW w:type="dxa" w:w="3135"/>
+          </w:tcPr>
+          <w:p>
+            <w:r>
+              <w:rPr>
+                <w:rFonts w:ascii="Times New Roman" w:hAnsi="Times New Roman"/>
+                <w:b w:val="0"/>
+                <w:i w:val="0"/>
+                <w:sz w:val="17"/>
+              </w:rPr>
+              <w:t>indeterminado</w:t>
+            </w:r>
+          </w:p>
+        </w:tc>
+      </w:tr>
+      <w:tr>
+        <w:tc>
+          <w:tcPr>
+            <w:tcW w:type="dxa" w:w="3135"/>
+          </w:tcPr>
+          <w:p>
+            <w:r>
+              <w:rPr>
+                <w:rFonts w:ascii="Times New Roman" w:hAnsi="Times New Roman"/>
+                <w:b w:val="0"/>
+                <w:i w:val="0"/>
+                <w:sz w:val="17"/>
+              </w:rPr>
+              <w:t>Fadiga mental</w:t>
+            </w:r>
+          </w:p>
+        </w:tc>
+        <w:tc>
+          <w:tcPr>
+            <w:tcW w:type="dxa" w:w="3135"/>
+          </w:tcPr>
+          <w:p>
+            <w:r>
+              <w:rPr>
+                <w:rFonts w:ascii="Times New Roman" w:hAnsi="Times New Roman"/>
+                <w:b w:val="0"/>
+                <w:i w:val="0"/>
+                <w:sz w:val="17"/>
+              </w:rPr>
+              <w:t>0,69</w:t>
+            </w:r>
+          </w:p>
+        </w:tc>
+        <w:tc>
+          <w:tcPr>
+            <w:tcW w:type="dxa" w:w="3135"/>
+          </w:tcPr>
+          <w:p>
+            <w:r>
+              <w:rPr>
+                <w:rFonts w:ascii="Times New Roman" w:hAnsi="Times New Roman"/>
+                <w:b w:val="0"/>
+                <w:i w:val="0"/>
+                <w:sz w:val="17"/>
+              </w:rPr>
+              <w:t>indeterminado</w:t>
+            </w:r>
+          </w:p>
+        </w:tc>
+      </w:tr>
+      <w:tr>
+        <w:tc>
+          <w:tcPr>
+            <w:tcW w:type="dxa" w:w="3135"/>
+          </w:tcPr>
+          <w:p>
+            <w:r>
+              <w:rPr>
+                <w:rFonts w:ascii="Times New Roman" w:hAnsi="Times New Roman"/>
+                <w:b w:val="0"/>
+                <w:i w:val="0"/>
+                <w:sz w:val="17"/>
+              </w:rPr>
+              <w:t>Tensão</w:t>
+            </w:r>
+          </w:p>
+        </w:tc>
+        <w:tc>
+          <w:tcPr>
+            <w:tcW w:type="dxa" w:w="3135"/>
+          </w:tcPr>
+          <w:p>
+            <w:r>
+              <w:rPr>
+                <w:rFonts w:ascii="Times New Roman" w:hAnsi="Times New Roman"/>
+                <w:b w:val="0"/>
+                <w:i w:val="0"/>
+                <w:sz w:val="17"/>
+              </w:rPr>
+              <w:t>5,93</w:t>
+            </w:r>
+          </w:p>
+        </w:tc>
+        <w:tc>
+          <w:tcPr>
+            <w:tcW w:type="dxa" w:w="3135"/>
+          </w:tcPr>
+          <w:p>
+            <w:r>
+              <w:rPr>
+                <w:rFonts w:ascii="Times New Roman" w:hAnsi="Times New Roman"/>
+                <w:b w:val="0"/>
+                <w:i w:val="0"/>
+                <w:sz w:val="17"/>
+              </w:rPr>
+              <w:t>evidência de efeito</w:t>
+            </w:r>
+          </w:p>
+        </w:tc>
+      </w:tr>
+      <w:tr>
+        <w:tc>
+          <w:tcPr>
+            <w:tcW w:type="dxa" w:w="3135"/>
+          </w:tcPr>
+          <w:p>
+            <w:r>
+              <w:rPr>
+                <w:rFonts w:ascii="Times New Roman" w:hAnsi="Times New Roman"/>
+                <w:b w:val="0"/>
+                <w:i w:val="0"/>
+                <w:sz w:val="17"/>
+              </w:rPr>
+              <w:t>Depressão</w:t>
+            </w:r>
+          </w:p>
+        </w:tc>
+        <w:tc>
+          <w:tcPr>
+            <w:tcW w:type="dxa" w:w="3135"/>
+          </w:tcPr>
+          <w:p>
+            <w:r>
+              <w:rPr>
+                <w:rFonts w:ascii="Times New Roman" w:hAnsi="Times New Roman"/>
+                <w:b w:val="0"/>
+                <w:i w:val="0"/>
+                <w:sz w:val="17"/>
+              </w:rPr>
+              <w:t>0,25</w:t>
+            </w:r>
+          </w:p>
+        </w:tc>
+        <w:tc>
+          <w:tcPr>
+            <w:tcW w:type="dxa" w:w="3135"/>
+          </w:tcPr>
+          <w:p>
+            <w:r>
+              <w:rPr>
+                <w:rFonts w:ascii="Times New Roman" w:hAnsi="Times New Roman"/>
+                <w:b w:val="0"/>
+                <w:i w:val="0"/>
+                <w:sz w:val="17"/>
+              </w:rPr>
+              <w:t>evidência de ausência</w:t>
+            </w:r>
+          </w:p>
+        </w:tc>
+      </w:tr>
+      <w:tr>
+        <w:tc>
+          <w:tcPr>
+            <w:tcW w:type="dxa" w:w="3135"/>
+          </w:tcPr>
+          <w:p>
+            <w:r>
+              <w:rPr>
+                <w:rFonts w:ascii="Times New Roman" w:hAnsi="Times New Roman"/>
+                <w:b w:val="0"/>
+                <w:i w:val="0"/>
+                <w:sz w:val="17"/>
+              </w:rPr>
+              <w:t>Raiva</w:t>
+            </w:r>
+          </w:p>
+        </w:tc>
+        <w:tc>
+          <w:tcPr>
+            <w:tcW w:type="dxa" w:w="3135"/>
+          </w:tcPr>
+          <w:p>
+            <w:r>
+              <w:rPr>
+                <w:rFonts w:ascii="Times New Roman" w:hAnsi="Times New Roman"/>
+                <w:b w:val="0"/>
+                <w:i w:val="0"/>
+                <w:sz w:val="17"/>
+              </w:rPr>
+              <w:t>0,22</w:t>
+            </w:r>
+          </w:p>
+        </w:tc>
+        <w:tc>
+          <w:tcPr>
+            <w:tcW w:type="dxa" w:w="3135"/>
+          </w:tcPr>
+          <w:p>
+            <w:r>
+              <w:rPr>
+                <w:rFonts w:ascii="Times New Roman" w:hAnsi="Times New Roman"/>
+                <w:b w:val="0"/>
+                <w:i w:val="0"/>
+                <w:sz w:val="17"/>
+              </w:rPr>
+              <w:t>evidência de ausência</w:t>
+            </w:r>
+          </w:p>
+        </w:tc>
+      </w:tr>
+      <w:tr>
+        <w:tc>
+          <w:tcPr>
+            <w:tcW w:type="dxa" w:w="3135"/>
+          </w:tcPr>
+          <w:p>
+            <w:r>
+              <w:rPr>
+                <w:rFonts w:ascii="Times New Roman" w:hAnsi="Times New Roman"/>
+                <w:b w:val="0"/>
+                <w:i w:val="0"/>
+                <w:sz w:val="17"/>
+              </w:rPr>
+              <w:t>Confusão</w:t>
+            </w:r>
+          </w:p>
+        </w:tc>
+        <w:tc>
+          <w:tcPr>
+            <w:tcW w:type="dxa" w:w="3135"/>
+          </w:tcPr>
+          <w:p>
+            <w:r>
+              <w:rPr>
+                <w:rFonts w:ascii="Times New Roman" w:hAnsi="Times New Roman"/>
+                <w:b w:val="0"/>
+                <w:i w:val="0"/>
+                <w:sz w:val="17"/>
+              </w:rPr>
+              <w:t>1,62</w:t>
+            </w:r>
+          </w:p>
+        </w:tc>
+        <w:tc>
+          <w:tcPr>
+            <w:tcW w:type="dxa" w:w="3135"/>
+          </w:tcPr>
+          <w:p>
+            <w:r>
+              <w:rPr>
+                <w:rFonts w:ascii="Times New Roman" w:hAnsi="Times New Roman"/>
+                <w:b w:val="0"/>
+                <w:i w:val="0"/>
+                <w:sz w:val="17"/>
+              </w:rPr>
+              <w:t>indeterminado</w:t>
+            </w:r>
+          </w:p>
+        </w:tc>
+      </w:tr>
+    </w:tbl>
+    <w:p>
+      <w:pPr>
+        <w:spacing w:after="120" w:line="240" w:lineRule="auto"/>
+      </w:pPr>
+      <w:r>
+        <w:rPr>
+          <w:rFonts w:ascii="Times New Roman" w:hAnsi="Times New Roman"/>
+          <w:b w:val="0"/>
+          <w:i w:val="0"/>
+          <w:sz w:val="18"/>
+        </w:rPr>
+        <w:t>Fonte: dados da pesquisa (2026).</w:t>
+      </w:r>
+    </w:p>
+    <w:p>
+      <w:pPr>
+        <w:spacing w:line="336" w:lineRule="auto"/>
+        <w:ind w:firstLine="709"/>
+        <w:jc w:val="both"/>
+      </w:pPr>
+      <w:r>
+        <w:rPr>
+          <w:rFonts w:ascii="Times New Roman" w:hAnsi="Times New Roman"/>
+          <w:b w:val="0"/>
+          <w:i w:val="0"/>
+          <w:sz w:val="22"/>
+        </w:rPr>
+        <w:t>Há evidência extrema a forte de efeito na fadiga física (BF₁₀ ≈ 4,6×10⁵), vigor (≈ 1.081), fadiga do BRUMS (14,2) e tensão (5,9); evidência de ausência de efeito na depressão (0,25) e na raiva (0,22), sustentando o custo somático e não afetivo; fadiga mental, PTH e confusão indeterminadas (poder amostral). O teste de equivalência (TOST, ROPE ±0,2 DP) não estabeleceu equivalência formal, dada a amostra de 25–27 atletas.</w:t>
+      </w:r>
+    </w:p>
+    <w:p>
+      <w:pPr>
+        <w:spacing w:before="80" w:line="240" w:lineRule="auto"/>
+        <w:jc w:val="center"/>
+      </w:pPr>
+      <w:r>
+        <w:rPr>
+          <w:rFonts w:ascii="Times New Roman" w:hAnsi="Times New Roman"/>
+          <w:b w:val="0"/>
+          <w:i w:val="0"/>
+          <w:sz w:val="19"/>
+        </w:rPr>
+        <w:t>Figura S13 – Fatores de Bayes (BF₁₀, escala logarítmica) para a mudança D1→D7</w:t>
+      </w:r>
+    </w:p>
+    <w:p>
+      <w:pPr>
+        <w:jc w:val="center"/>
+      </w:pPr>
+      <w:r>
+        <w:drawing>
+          <wp:inline xmlns:a="http://schemas.openxmlformats.org/drawingml/2006/main" xmlns:pic="http://schemas.openxmlformats.org/drawingml/2006/picture">
+            <wp:extent cx="5120640" cy="2432304"/>
+            <wp:docPr id="13" name="Picture 13"/>
+            <wp:cNvGraphicFramePr>
+              <a:graphicFrameLocks noChangeAspect="1"/>
+            </wp:cNvGraphicFramePr>
+            <a:graphic>
+              <a:graphicData uri="http://schemas.openxmlformats.org/drawingml/2006/picture">
+                <pic:pic>
+                  <pic:nvPicPr>
+                    <pic:cNvPr id="0" name="x_bayes.png"/>
+                    <pic:cNvPicPr/>
+                  </pic:nvPicPr>
+                  <pic:blipFill>
+                    <a:blip r:embed="rId21"/>
+                    <a:stretch>
+                      <a:fillRect/>
+                    </a:stretch>
+                  </pic:blipFill>
+                  <pic:spPr>
+                    <a:xfrm>
+                      <a:off x="0" y="0"/>
+                      <a:ext cx="5120640" cy="2432304"/>
+                    </a:xfrm>
+                    <a:prstGeom prst="rect"/>
+                  </pic:spPr>
+                </pic:pic>
+              </a:graphicData>
+            </a:graphic>
+          </wp:inline>
+        </w:drawing>
+      </w:r>
+    </w:p>
+    <w:p>
+      <w:pPr>
+        <w:spacing w:after="120" w:line="240" w:lineRule="auto"/>
+        <w:jc w:val="center"/>
+      </w:pPr>
+      <w:r>
+        <w:rPr>
+          <w:rFonts w:ascii="Times New Roman" w:hAnsi="Times New Roman"/>
+          <w:b w:val="0"/>
+          <w:i w:val="0"/>
+          <w:sz w:val="18"/>
+        </w:rPr>
+        <w:t>Fonte: elaborado pelos autores (2026).</w:t>
+      </w:r>
+    </w:p>
+    <w:p>
+      <w:pPr>
         <w:spacing w:line="336" w:lineRule="auto"/>
         <w:jc w:val="both"/>
       </w:pPr>

</xml_diff>